<commit_message>
Credit Statement, other formatting
</commit_message>
<xml_diff>
--- a/LeafMesos-STOTEN.docx
+++ b/LeafMesos-STOTEN.docx
@@ -419,6 +419,83 @@
     </w:p>
     <w:p>
       <w:pPr>
+        <w:spacing w:after="0"/>
+        <w:jc w:val="left"/>
+      </w:pPr>
+      <w:r>
+        <w:br w:type="page"/>
+      </w:r>
+    </w:p>
+    <w:p>
+      <w:pPr>
+        <w:spacing w:after="0"/>
+        <w:jc w:val="left"/>
+      </w:pPr>
+      <w:r>
+        <w:lastRenderedPageBreak/>
+        <w:t>GRAPHICAL ABSTRACT:</w:t>
+      </w:r>
+    </w:p>
+    <w:p>
+      <w:pPr>
+        <w:spacing w:after="0"/>
+        <w:jc w:val="left"/>
+      </w:pPr>
+    </w:p>
+    <w:p>
+      <w:pPr>
+        <w:pStyle w:val="BGKeywords"/>
+        <w:jc w:val="center"/>
+      </w:pPr>
+      <w:r>
+        <w:rPr>
+          <w:noProof/>
+        </w:rPr>
+        <w:drawing>
+          <wp:inline distT="0" distB="0" distL="0" distR="0" wp14:anchorId="3843C894" wp14:editId="20B10E18">
+            <wp:extent cx="5745480" cy="3093720"/>
+            <wp:effectExtent l="0" t="0" r="7620" b="0"/>
+            <wp:docPr id="529979414" name="Picture 1"/>
+            <wp:cNvGraphicFramePr>
+              <a:graphicFrameLocks xmlns:a="http://schemas.openxmlformats.org/drawingml/2006/main" noChangeAspect="1"/>
+            </wp:cNvGraphicFramePr>
+            <a:graphic xmlns:a="http://schemas.openxmlformats.org/drawingml/2006/main">
+              <a:graphicData uri="http://schemas.openxmlformats.org/drawingml/2006/picture">
+                <pic:pic xmlns:pic="http://schemas.openxmlformats.org/drawingml/2006/picture">
+                  <pic:nvPicPr>
+                    <pic:cNvPr id="529979414" name="Picture 529979414"/>
+                    <pic:cNvPicPr/>
+                  </pic:nvPicPr>
+                  <pic:blipFill>
+                    <a:blip r:embed="rId17" cstate="print">
+                      <a:extLst>
+                        <a:ext uri="{28A0092B-C50C-407E-A947-70E740481C1C}">
+                          <a14:useLocalDpi xmlns:a14="http://schemas.microsoft.com/office/drawing/2010/main" val="0"/>
+                        </a:ext>
+                      </a:extLst>
+                    </a:blip>
+                    <a:stretch>
+                      <a:fillRect/>
+                    </a:stretch>
+                  </pic:blipFill>
+                  <pic:spPr>
+                    <a:xfrm>
+                      <a:off x="0" y="0"/>
+                      <a:ext cx="5768941" cy="3106353"/>
+                    </a:xfrm>
+                    <a:prstGeom prst="rect">
+                      <a:avLst/>
+                    </a:prstGeom>
+                  </pic:spPr>
+                </pic:pic>
+              </a:graphicData>
+            </a:graphic>
+          </wp:inline>
+        </w:drawing>
+      </w:r>
+    </w:p>
+    <w:p>
+      <w:pPr>
         <w:pStyle w:val="SNSynopsisTOC"/>
         <w:spacing w:after="240"/>
         <w:jc w:val="left"/>
@@ -515,49 +592,7 @@
         <w:rPr>
           <w:rFonts w:cs="Times"/>
         </w:rPr>
-        <w:t>(</w:t>
-      </w:r>
-      <w:proofErr w:type="spellStart"/>
-      <w:r>
-        <w:rPr>
-          <w:rFonts w:cs="Times"/>
-        </w:rPr>
-        <w:t>Guisan</w:t>
-      </w:r>
-      <w:proofErr w:type="spellEnd"/>
-      <w:r>
-        <w:rPr>
-          <w:rFonts w:cs="Times"/>
-        </w:rPr>
-        <w:t xml:space="preserve"> and </w:t>
-      </w:r>
-      <w:proofErr w:type="spellStart"/>
-      <w:r>
-        <w:rPr>
-          <w:rFonts w:cs="Times"/>
-        </w:rPr>
-        <w:t>Thuiller</w:t>
-      </w:r>
-      <w:proofErr w:type="spellEnd"/>
-      <w:r>
-        <w:rPr>
-          <w:rFonts w:cs="Times"/>
-        </w:rPr>
-        <w:t xml:space="preserve">, 2005; </w:t>
-      </w:r>
-      <w:proofErr w:type="spellStart"/>
-      <w:r>
-        <w:rPr>
-          <w:rFonts w:cs="Times"/>
-        </w:rPr>
-        <w:t>Magurran</w:t>
-      </w:r>
-      <w:proofErr w:type="spellEnd"/>
-      <w:r>
-        <w:rPr>
-          <w:rFonts w:cs="Times"/>
-        </w:rPr>
-        <w:t>, 2004)</w:t>
+        <w:t>(Guisan and Thuiller, 2005; Magurran, 2004)</w:t>
       </w:r>
       <w:r>
         <w:fldChar w:fldCharType="end"/>
@@ -584,21 +619,7 @@
         <w:rPr>
           <w:rFonts w:cs="Times"/>
         </w:rPr>
-        <w:t>(</w:t>
-      </w:r>
-      <w:proofErr w:type="spellStart"/>
-      <w:r>
-        <w:rPr>
-          <w:rFonts w:cs="Times"/>
-        </w:rPr>
-        <w:t>Fediajevaite</w:t>
-      </w:r>
-      <w:proofErr w:type="spellEnd"/>
-      <w:r>
-        <w:rPr>
-          <w:rFonts w:cs="Times"/>
-        </w:rPr>
-        <w:t xml:space="preserve"> et al., 2021)</w:t>
+        <w:t>(Fediajevaite et al., 2021)</w:t>
       </w:r>
       <w:r>
         <w:fldChar w:fldCharType="end"/>
@@ -788,21 +809,7 @@
         <w:rPr>
           <w:rFonts w:cs="Times"/>
         </w:rPr>
-        <w:t>(</w:t>
-      </w:r>
-      <w:proofErr w:type="spellStart"/>
-      <w:r>
-        <w:rPr>
-          <w:rFonts w:cs="Times"/>
-        </w:rPr>
-        <w:t>Thalinger</w:t>
-      </w:r>
-      <w:proofErr w:type="spellEnd"/>
-      <w:r>
-        <w:rPr>
-          <w:rFonts w:cs="Times"/>
-        </w:rPr>
-        <w:t xml:space="preserve"> et al., 2021)</w:t>
+        <w:t>(Thalinger et al., 2021)</w:t>
       </w:r>
       <w:r>
         <w:fldChar w:fldCharType="end"/>
@@ -914,35 +921,7 @@
         <w:rPr>
           <w:rFonts w:cs="Times"/>
         </w:rPr>
-        <w:t xml:space="preserve">(Dettinger and Diaz, 2000; </w:t>
-      </w:r>
-      <w:proofErr w:type="spellStart"/>
-      <w:r>
-        <w:rPr>
-          <w:rFonts w:cs="Times"/>
-        </w:rPr>
-        <w:t>Hullar</w:t>
-      </w:r>
-      <w:proofErr w:type="spellEnd"/>
-      <w:r>
-        <w:rPr>
-          <w:rFonts w:cs="Times"/>
-        </w:rPr>
-        <w:t xml:space="preserve"> et al., 2006; </w:t>
-      </w:r>
-      <w:proofErr w:type="spellStart"/>
-      <w:r>
-        <w:rPr>
-          <w:rFonts w:cs="Times"/>
-        </w:rPr>
-        <w:t>Polato</w:t>
-      </w:r>
-      <w:proofErr w:type="spellEnd"/>
-      <w:r>
-        <w:rPr>
-          <w:rFonts w:cs="Times"/>
-        </w:rPr>
-        <w:t xml:space="preserve"> et al., 2018)</w:t>
+        <w:t>(Dettinger and Diaz, 2000; Hullar et al., 2006; Polato et al., 2018)</w:t>
       </w:r>
       <w:r>
         <w:fldChar w:fldCharType="end"/>
@@ -987,21 +966,7 @@
         <w:rPr>
           <w:rFonts w:cs="Times"/>
         </w:rPr>
-        <w:t xml:space="preserve">(Curtis et al., 2021; </w:t>
-      </w:r>
-      <w:proofErr w:type="spellStart"/>
-      <w:r>
-        <w:rPr>
-          <w:rFonts w:cs="Times"/>
-        </w:rPr>
-        <w:t>Thalinger</w:t>
-      </w:r>
-      <w:proofErr w:type="spellEnd"/>
-      <w:r>
-        <w:rPr>
-          <w:rFonts w:cs="Times"/>
-        </w:rPr>
-        <w:t xml:space="preserve"> et al., 2021)</w:t>
+        <w:t>(Curtis et al., 2021; Thalinger et al., 2021)</w:t>
       </w:r>
       <w:r>
         <w:fldChar w:fldCharType="end"/>
@@ -1455,15 +1420,7 @@
         <w:t>Fig. 1A</w:t>
       </w:r>
       <w:r>
-        <w:t xml:space="preserve">). Our experimental design included six different experimental treatments, each with four mesocosm replicates: no leachate or litter (“Control”); leaf leachate only (“DOC”); low density, uncolonized litter (“Low Leaves”); low density, colonized litter (“Low Leaves + Biofilm”); high density, uncolonized litter (“High Leaves”); and high-density, colonized litter (“High Leaves + Biofilm”). For the controls, we included only groundwater such that these mesocosms represented the removal of eDNA from degradation alone. For the leaf leachate treatments, we added 53.2 mg/L of sugar maple leaf leachate (Acer Saccharum Marshall) to each mesocosm prior to our eDNA additions. In the four treatments where we added leaf litter, we used two densities of leaves, </w:t>
-      </w:r>
-      <w:proofErr w:type="gramStart"/>
-      <w:r>
-        <w:t>low(</w:t>
-      </w:r>
-      <w:proofErr w:type="gramEnd"/>
-      <w:r>
-        <w:t>51 g m</w:t>
+        <w:t>). Our experimental design included six different experimental treatments, each with four mesocosm replicates: no leachate or litter (“Control”); leaf leachate only (“DOC”); low density, uncolonized litter (“Low Leaves”); low density, colonized litter (“Low Leaves + Biofilm”); high density, uncolonized litter (“High Leaves”); and high-density, colonized litter (“High Leaves + Biofilm”). For the controls, we included only groundwater such that these mesocosms represented the removal of eDNA from degradation alone. For the leaf leachate treatments, we added 53.2 mg/L of sugar maple leaf leachate (Acer Saccharum Marshall) to each mesocosm prior to our eDNA additions. In the four treatments where we added leaf litter, we used two densities of leaves, low(51 g m</w:t>
       </w:r>
       <w:r>
         <w:rPr>
@@ -1573,7 +1530,7 @@
                     <pic:cNvPicPr preferRelativeResize="0"/>
                   </pic:nvPicPr>
                   <pic:blipFill>
-                    <a:blip r:embed="rId17"/>
+                    <a:blip r:embed="rId18"/>
                     <a:srcRect t="-1896" b="1896"/>
                     <a:stretch>
                       <a:fillRect/>
@@ -1969,21 +1926,7 @@
         <w:rPr>
           <w:rFonts w:cs="Times"/>
         </w:rPr>
-        <w:t>(</w:t>
-      </w:r>
-      <w:proofErr w:type="spellStart"/>
-      <w:r>
-        <w:rPr>
-          <w:rFonts w:cs="Times"/>
-        </w:rPr>
-        <w:t>Klymus</w:t>
-      </w:r>
-      <w:proofErr w:type="spellEnd"/>
-      <w:r>
-        <w:rPr>
-          <w:rFonts w:cs="Times"/>
-        </w:rPr>
-        <w:t xml:space="preserve"> et al., 2020)</w:t>
+        <w:t>(Klymus et al., 2020)</w:t>
       </w:r>
       <w:r>
         <w:fldChar w:fldCharType="end"/>
@@ -2501,6 +2444,9 @@
         <w:t>”</w:t>
       </w:r>
       <w:r>
+        <w:t xml:space="preserve"> </w:t>
+      </w:r>
+      <w:r>
         <w:fldChar w:fldCharType="begin"/>
       </w:r>
       <w:r>
@@ -2789,7 +2735,7 @@
                     <pic:cNvPicPr preferRelativeResize="0"/>
                   </pic:nvPicPr>
                   <pic:blipFill>
-                    <a:blip r:embed="rId18"/>
+                    <a:blip r:embed="rId19"/>
                     <a:srcRect l="102" r="102"/>
                     <a:stretch>
                       <a:fillRect/>
@@ -2941,7 +2887,7 @@
                     <pic:cNvPicPr preferRelativeResize="0"/>
                   </pic:nvPicPr>
                   <pic:blipFill>
-                    <a:blip r:embed="rId19"/>
+                    <a:blip r:embed="rId20"/>
                     <a:srcRect/>
                     <a:stretch>
                       <a:fillRect/>
@@ -3403,7 +3349,7 @@
                     <pic:cNvPicPr preferRelativeResize="0"/>
                   </pic:nvPicPr>
                   <pic:blipFill rotWithShape="1">
-                    <a:blip r:embed="rId20">
+                    <a:blip r:embed="rId21">
                       <a:extLst>
                         <a:ext uri="{28A0092B-C50C-407E-A947-70E740481C1C}">
                           <a14:useLocalDpi xmlns:a14="http://schemas.microsoft.com/office/drawing/2010/main" val="0"/>
@@ -3698,7 +3644,7 @@
         <w:spacing w:after="240"/>
         <w:ind w:firstLine="0"/>
         <w:sectPr>
-          <w:headerReference w:type="default" r:id="rId21"/>
+          <w:headerReference w:type="default" r:id="rId22"/>
           <w:type w:val="continuous"/>
           <w:pgSz w:w="12240" w:h="15840"/>
           <w:pgMar w:top="1440" w:right="1440" w:bottom="1440" w:left="1440" w:header="144" w:footer="0" w:gutter="0"/>
@@ -4334,21 +4280,7 @@
         <w:rPr>
           <w:rFonts w:cs="Times"/>
         </w:rPr>
-        <w:t xml:space="preserve">(Marks, 2019; </w:t>
-      </w:r>
-      <w:proofErr w:type="spellStart"/>
-      <w:r>
-        <w:rPr>
-          <w:rFonts w:cs="Times"/>
-        </w:rPr>
-        <w:t>Suberkropp</w:t>
-      </w:r>
-      <w:proofErr w:type="spellEnd"/>
-      <w:r>
-        <w:rPr>
-          <w:rFonts w:cs="Times"/>
-        </w:rPr>
-        <w:t xml:space="preserve"> and Klug, 1980)</w:t>
+        <w:t>(Marks, 2019; Suberkropp and Klug, 1980)</w:t>
       </w:r>
       <w:r>
         <w:fldChar w:fldCharType="end"/>
@@ -4462,23 +4394,7 @@
           <w:rFonts w:cs="Times"/>
           <w:szCs w:val="24"/>
         </w:rPr>
-        <w:t>(</w:t>
-      </w:r>
-      <w:proofErr w:type="spellStart"/>
-      <w:r>
-        <w:rPr>
-          <w:rFonts w:cs="Times"/>
-          <w:szCs w:val="24"/>
-        </w:rPr>
-        <w:t>Bärlocher</w:t>
-      </w:r>
-      <w:proofErr w:type="spellEnd"/>
-      <w:r>
-        <w:rPr>
-          <w:rFonts w:cs="Times"/>
-          <w:szCs w:val="24"/>
-        </w:rPr>
-        <w:t>, 1980)</w:t>
+        <w:t>(Bärlocher, 1980)</w:t>
       </w:r>
       <w:r>
         <w:fldChar w:fldCharType="end"/>
@@ -4658,8 +4574,8 @@
         <w:spacing w:after="0"/>
         <w:jc w:val="left"/>
         <w:sectPr>
-          <w:footerReference w:type="even" r:id="rId22"/>
-          <w:footerReference w:type="default" r:id="rId23"/>
+          <w:footerReference w:type="even" r:id="rId23"/>
+          <w:footerReference w:type="default" r:id="rId24"/>
           <w:type w:val="continuous"/>
           <w:pgSz w:w="12240" w:h="15840"/>
           <w:pgMar w:top="1440" w:right="1440" w:bottom="1440" w:left="1440" w:header="0" w:footer="0" w:gutter="0"/>
@@ -4812,7 +4728,7 @@
       <w:r>
         <w:t xml:space="preserve">Erik Curtis – Department of Biological Sciences, University of Notre Dame, Notre Dame, Indiana 46556, United States; Email: </w:t>
       </w:r>
-      <w:hyperlink r:id="rId24" w:history="1">
+      <w:hyperlink r:id="rId25" w:history="1">
         <w:r>
           <w:rPr>
             <w:rStyle w:val="Hyperlink"/>
@@ -4833,7 +4749,7 @@
         <w:lastRenderedPageBreak/>
         <w:t xml:space="preserve">* Jennifer Tank – Department of Biological Sciences, University of Notre Dame, Notre Dame, Indiana 46556, Unites States; Email: </w:t>
       </w:r>
-      <w:hyperlink r:id="rId25" w:history="1">
+      <w:hyperlink r:id="rId26" w:history="1">
         <w:r>
           <w:rPr>
             <w:rStyle w:val="Hyperlink"/>
@@ -4918,8 +4834,13 @@
       <w:pPr>
         <w:pStyle w:val="FAAuthorInfoSubtitle"/>
       </w:pPr>
-      <w:r>
-        <w:t>Author Contributions</w:t>
+      <w:proofErr w:type="spellStart"/>
+      <w:r>
+        <w:t>CRediT</w:t>
+      </w:r>
+      <w:proofErr w:type="spellEnd"/>
+      <w:r>
+        <w:t xml:space="preserve"> authorship Contribution Statement</w:t>
       </w:r>
     </w:p>
     <w:p>
@@ -4927,70 +4848,152 @@
         <w:pStyle w:val="FAAuthorInfoSubtitle"/>
       </w:pPr>
       <w:r>
-        <w:t>J.L.T., D.B., A.J.S., G.A.L., K.B., and S.P.E. conceptualized the</w:t>
-      </w:r>
-      <w:r>
+        <w:rPr>
+          <w:b/>
+          <w:bCs w:val="0"/>
+        </w:rPr>
+        <w:t>Erik Curtis</w:t>
+      </w:r>
+      <w:r>
+        <w:t xml:space="preserve">: Formal Analysis, Investigation, Data Curation, Writing – Original Draft, Visualization, </w:t>
+      </w:r>
+      <w:r>
+        <w:rPr>
+          <w:b/>
+          <w:bCs w:val="0"/>
+        </w:rPr>
+        <w:t>Jennifer L. Tank</w:t>
+      </w:r>
+      <w:r>
+        <w:t>:</w:t>
+      </w:r>
+      <w:r>
+        <w:rPr>
+          <w:b/>
+          <w:bCs w:val="0"/>
+        </w:rPr>
         <w:t xml:space="preserve"> </w:t>
       </w:r>
       <w:r>
-        <w:t xml:space="preserve">work; J.L.T., E.D.S., D.B., </w:t>
-      </w:r>
-      <w:r>
-        <w:t xml:space="preserve">P.F.P.B.-D., </w:t>
-      </w:r>
-      <w:r>
-        <w:t xml:space="preserve">and S.P.E. designed the experiment; </w:t>
-      </w:r>
-      <w:r>
-        <w:t xml:space="preserve">E.M.C, </w:t>
-      </w:r>
-      <w:r>
-        <w:t>P.F.P.B.-D. and</w:t>
+        <w:t xml:space="preserve">Conceptualization, Writing – Review and Editing, Funding Acquisition, Supervision, </w:t>
+      </w:r>
+      <w:r>
+        <w:rPr>
+          <w:b/>
+          <w:bCs w:val="0"/>
+        </w:rPr>
+        <w:t>Elise D. Snyder</w:t>
+      </w:r>
+      <w:r>
+        <w:t xml:space="preserve">: Conceptualization, Investigation, Writing – Review and Editing, Visualization, </w:t>
+      </w:r>
+      <w:r>
+        <w:rPr>
+          <w:b/>
+          <w:bCs w:val="0"/>
+        </w:rPr>
+        <w:t>Pedro F.P</w:t>
+      </w:r>
+      <w:r>
+        <w:rPr>
+          <w:b/>
+          <w:bCs w:val="0"/>
+        </w:rPr>
+        <w:t xml:space="preserve">. </w:t>
+      </w:r>
+      <w:r>
+        <w:rPr>
+          <w:b/>
+          <w:bCs w:val="0"/>
+        </w:rPr>
+        <w:t>Brandão-Dias</w:t>
+      </w:r>
+      <w:r>
+        <w:rPr>
+          <w:b/>
+          <w:bCs w:val="0"/>
+        </w:rPr>
+        <w:t xml:space="preserve">: </w:t>
+      </w:r>
+      <w:r>
+        <w:t xml:space="preserve">Conceptualization, Investigation, Formal Analysis, Writing – Review and Editing, </w:t>
+      </w:r>
+      <w:r>
+        <w:rPr>
+          <w:b/>
+          <w:bCs w:val="0"/>
+        </w:rPr>
+        <w:t>Kyle Bibby</w:t>
+      </w:r>
+      <w:r>
+        <w:t xml:space="preserve">: </w:t>
+      </w:r>
+      <w:r>
+        <w:t>Conceptualization, Writing – Review and Editing, Funding Acquisition, Supervision,</w:t>
       </w:r>
       <w:r>
         <w:t xml:space="preserve"> </w:t>
       </w:r>
       <w:r>
-        <w:t xml:space="preserve">E.D.S. performed the experiment; </w:t>
-      </w:r>
-      <w:r>
-        <w:t xml:space="preserve">E.M.C. </w:t>
-      </w:r>
-      <w:r>
-        <w:t xml:space="preserve">processed eDNA samples; </w:t>
-      </w:r>
-      <w:r>
-        <w:t xml:space="preserve">E.M.C., </w:t>
-      </w:r>
-      <w:r>
-        <w:t xml:space="preserve">E.D.S., </w:t>
-      </w:r>
-      <w:r>
-        <w:t>P.F.P.B.-D., J.L.T analyzed experimental data; all</w:t>
+        <w:rPr>
+          <w:b/>
+          <w:bCs w:val="0"/>
+        </w:rPr>
+        <w:t>Arial J. Shogren:</w:t>
       </w:r>
       <w:r>
         <w:t xml:space="preserve"> </w:t>
       </w:r>
       <w:r>
-        <w:t xml:space="preserve">authors discussed findings; </w:t>
-      </w:r>
-      <w:r>
-        <w:t>E.M.C.</w:t>
-      </w:r>
-      <w:r>
-        <w:t xml:space="preserve"> wrote first manuscript draft; and all</w:t>
+        <w:t>Conceptualization, Writing – Review and Editing, Funding Acquisition, Supervision,</w:t>
       </w:r>
       <w:r>
         <w:t xml:space="preserve"> </w:t>
       </w:r>
       <w:r>
-        <w:t>authors contributed to</w:t>
+        <w:rPr>
+          <w:b/>
+          <w:bCs w:val="0"/>
+        </w:rPr>
+        <w:t>Diogo Bolster</w:t>
+      </w:r>
+      <w:r>
+        <w:t xml:space="preserve">: </w:t>
+      </w:r>
+      <w:r>
+        <w:t>Conceptualization, Writing – Review and Editing, Funding Acquisition, Supervision,</w:t>
       </w:r>
       <w:r>
         <w:t xml:space="preserve"> </w:t>
       </w:r>
       <w:r>
-        <w:t>manuscript editing.</w:t>
+        <w:rPr>
+          <w:b/>
+          <w:bCs w:val="0"/>
+        </w:rPr>
+        <w:t>Scott P. Egan:</w:t>
+      </w:r>
+      <w:r>
+        <w:t xml:space="preserve"> </w:t>
+      </w:r>
+      <w:r>
+        <w:t>Conceptualization, Writing – Review and Editing, Funding Acquisition, Supervision,</w:t>
+      </w:r>
+      <w:r>
+        <w:t xml:space="preserve"> </w:t>
+      </w:r>
+      <w:r>
+        <w:rPr>
+          <w:b/>
+          <w:bCs w:val="0"/>
+        </w:rPr>
+        <w:t xml:space="preserve">Gary A. Lamberti: </w:t>
+      </w:r>
+      <w:r>
+        <w:t>Conceptualization, Writing – Review and Editing, Funding Acquisition, Supervision</w:t>
+      </w:r>
+      <w:r>
+        <w:t>.</w:t>
       </w:r>
     </w:p>
     <w:p>
@@ -4998,7 +5001,7 @@
         <w:pStyle w:val="FAAuthorInfoSubtitle"/>
       </w:pPr>
       <w:r>
-        <w:t>Notes</w:t>
+        <w:t>NOTES</w:t>
       </w:r>
     </w:p>
     <w:p>
@@ -5024,7 +5027,13 @@
       <w:pPr>
         <w:spacing w:line="276" w:lineRule="auto"/>
       </w:pPr>
-      <w:r>
+    </w:p>
+    <w:p>
+      <w:pPr>
+        <w:spacing w:line="276" w:lineRule="auto"/>
+      </w:pPr>
+      <w:r>
+        <w:lastRenderedPageBreak/>
         <w:t>ACKNOWLEDGMENT</w:t>
       </w:r>
       <w:r>
@@ -5047,14 +5056,16 @@
         <w:t xml:space="preserve"> from Bodine State Hatchery and Amanda Brunson-Cruz from the Potawatomi Zoo for access to water from their facilities for target eDNA. This study was supported </w:t>
       </w:r>
       <w:r>
-        <w:lastRenderedPageBreak/>
         <w:t xml:space="preserve">through funding from the </w:t>
       </w:r>
       <w:r>
         <w:t>U.S. Department of Defense (DoD) Strategic Environmental Research and Development Program (SERDP, Project RC19-1276)</w:t>
       </w:r>
       <w:r>
-        <w:t xml:space="preserve">, and support to E.M.C. from the Glynn Family Honors Program at the University of Notre Dame as part of his undergraduate thesis. </w:t>
+        <w:t>, and support to E.M.C. from the Glynn Family Honors Program at the University of Notre Dame</w:t>
+      </w:r>
+      <w:r>
+        <w:t>.</w:t>
       </w:r>
     </w:p>
     <w:p>
@@ -5099,15 +5110,7 @@
         <w:pStyle w:val="Bibliography"/>
       </w:pPr>
       <w:r>
-        <w:t xml:space="preserve">Austen, G.E., </w:t>
-      </w:r>
-      <w:proofErr w:type="spellStart"/>
-      <w:r>
-        <w:t>Bindemann</w:t>
-      </w:r>
-      <w:proofErr w:type="spellEnd"/>
-      <w:r>
-        <w:t>, M., Griffiths, R.A., Roberts, D.L., 2016. Species identification by experts and non-experts: comparing images from field guides. Sci Rep 6, 33634. https://doi.org/10.1038/srep33634</w:t>
+        <w:t>Austen, G.E., Bindemann, M., Griffiths, R.A., Roberts, D.L., 2016. Species identification by experts and non-experts: comparing images from field guides. Sci Rep 6, 33634. https://doi.org/10.1038/srep33634</w:t>
       </w:r>
     </w:p>
     <w:p>
@@ -5117,27 +5120,28 @@
           <w:lang w:val="pt-BR"/>
         </w:rPr>
       </w:pPr>
-      <w:proofErr w:type="spellStart"/>
-      <w:r>
-        <w:t>Bärlocher</w:t>
-      </w:r>
-      <w:proofErr w:type="spellEnd"/>
-      <w:r>
-        <w:t xml:space="preserve">, F., 1980. Leaf-eating invertebrates as competitors of aquatic hyphomycetes. </w:t>
-      </w:r>
-      <w:proofErr w:type="spellStart"/>
+      <w:r>
+        <w:t xml:space="preserve">Bärlocher, F., 1980. Leaf-eating invertebrates as competitors of aquatic hyphomycetes. </w:t>
+      </w:r>
       <w:r>
         <w:rPr>
           <w:lang w:val="pt-BR"/>
         </w:rPr>
-        <w:t>Oecologia</w:t>
-      </w:r>
-      <w:proofErr w:type="spellEnd"/>
+        <w:t>Oecologia 47, 303–306. https://doi.org/10.1007/BF00398521</w:t>
+      </w:r>
+    </w:p>
+    <w:p>
+      <w:pPr>
+        <w:pStyle w:val="Bibliography"/>
+      </w:pPr>
       <w:r>
         <w:rPr>
           <w:lang w:val="pt-BR"/>
         </w:rPr>
-        <w:t xml:space="preserve"> 47, 303–306. https://doi.org/10.1007/BF00398521</w:t>
+        <w:t xml:space="preserve">Barnes, M.A., Turner, C.R., 2016. </w:t>
+      </w:r>
+      <w:r>
+        <w:t>The ecology of environmental DNA and implications for conservation genetics. Conserv Genet 17, 1–17. https://doi.org/10.1007/s10592-015-0775-4</w:t>
       </w:r>
     </w:p>
     <w:p>
@@ -5145,21 +5149,7 @@
         <w:pStyle w:val="Bibliography"/>
       </w:pPr>
       <w:r>
-        <w:rPr>
-          <w:lang w:val="pt-BR"/>
-        </w:rPr>
-        <w:t xml:space="preserve">Barnes, M.A., Turner, C.R., 2016. </w:t>
-      </w:r>
-      <w:r>
-        <w:t xml:space="preserve">The ecology of environmental DNA and implications for conservation genetics. </w:t>
-      </w:r>
-      <w:proofErr w:type="spellStart"/>
-      <w:r>
-        <w:t>Conserv</w:t>
-      </w:r>
-      <w:proofErr w:type="spellEnd"/>
-      <w:r>
-        <w:t xml:space="preserve"> Genet 17, 1–17. https://doi.org/10.1007/s10592-015-0775-4</w:t>
+        <w:t>Barry J. F. Biggs, 1996. Patterns in Benthic Algae of Streams, in: Algal Ecology: Freshwater Benthic Ecosystems, Aquatic Ecology Series. Academic Press, San Diego, pp. 31–56.</w:t>
       </w:r>
     </w:p>
     <w:p>
@@ -5167,76 +5157,38 @@
         <w:pStyle w:val="Bibliography"/>
       </w:pPr>
       <w:r>
-        <w:t>Barry J. F. Biggs, 1996. Patterns in Benthic Algae of Streams, in: Algal Ecology: Freshwater Benthic Ecosystems, Aquatic Ecology Series. Academic Press, San Diego, pp. 31–56.</w:t>
+        <w:t>Bates, D., Mächler, M., Bolker, B., Walker, S., 2015. Fitting Linear Mixed-Effects Models Using lme4. Journal of Statistical Software 67, 1–48. https://doi.org/10.18637/jss.v067.i01</w:t>
       </w:r>
     </w:p>
     <w:p>
       <w:pPr>
         <w:pStyle w:val="Bibliography"/>
-      </w:pPr>
-      <w:r>
-        <w:t xml:space="preserve">Bates, D., </w:t>
-      </w:r>
-      <w:proofErr w:type="spellStart"/>
-      <w:r>
-        <w:t>Mächler</w:t>
-      </w:r>
-      <w:proofErr w:type="spellEnd"/>
-      <w:r>
-        <w:t>, M., Bolker, B., Walker, S., 2015. Fitting Linear Mixed-Effects Models Using lme4. Journal of Statistical Software 67, 1–48. https://doi.org/10.18637/jss.v067.i01</w:t>
+        <w:rPr>
+          <w:lang w:val="fr-FR"/>
+        </w:rPr>
+      </w:pPr>
+      <w:r>
+        <w:t xml:space="preserve">Brandão-Dias, P.F.. P., Tank, J.L., Snyder, E.D., Mahl, U.H., Peters, B., Bolster, D., Shogren, A.J., Lamberti, G.A., Bibby, K., Egan, S.P., 2023. Suspended Materials Affect Particle Size Distribution and Removal of Environmental DNA in Flowing Waters. </w:t>
+      </w:r>
+      <w:r>
+        <w:rPr>
+          <w:lang w:val="fr-FR"/>
+        </w:rPr>
+        <w:t>Environ. Sci. Technol. acs.est.3c02638. https://doi.org/10.1021/acs.est.3c02638</w:t>
       </w:r>
     </w:p>
     <w:p>
       <w:pPr>
         <w:pStyle w:val="Bibliography"/>
+      </w:pPr>
+      <w:r>
         <w:rPr>
           <w:lang w:val="fr-FR"/>
         </w:rPr>
-      </w:pPr>
-      <w:r>
-        <w:t xml:space="preserve">Brandão-Dias, </w:t>
-      </w:r>
-      <w:proofErr w:type="gramStart"/>
-      <w:r>
-        <w:t>P.F..</w:t>
-      </w:r>
-      <w:proofErr w:type="gramEnd"/>
-      <w:r>
-        <w:t xml:space="preserve"> P., Tank, J.L., Snyder, E.D., Mahl, U.H., Peters, B., Bolster, D., Shogren, A.J., Lamberti, G.A., Bibby, K., Egan, S.P., 2023. Suspended Materials Affect Particle Size Distribution and Removal of Environmental DNA in Flowing Waters. </w:t>
-      </w:r>
-      <w:r>
-        <w:rPr>
-          <w:lang w:val="fr-FR"/>
-        </w:rPr>
-        <w:t xml:space="preserve">Environ. </w:t>
-      </w:r>
-      <w:proofErr w:type="spellStart"/>
-      <w:r>
-        <w:rPr>
-          <w:lang w:val="fr-FR"/>
-        </w:rPr>
-        <w:t>Sci</w:t>
-      </w:r>
-      <w:proofErr w:type="spellEnd"/>
-      <w:r>
-        <w:rPr>
-          <w:lang w:val="fr-FR"/>
-        </w:rPr>
-        <w:t xml:space="preserve">. </w:t>
-      </w:r>
-      <w:proofErr w:type="spellStart"/>
-      <w:r>
-        <w:rPr>
-          <w:lang w:val="fr-FR"/>
-        </w:rPr>
-        <w:t>Technol</w:t>
-      </w:r>
-      <w:proofErr w:type="spellEnd"/>
-      <w:r>
-        <w:rPr>
-          <w:lang w:val="fr-FR"/>
-        </w:rPr>
-        <w:t>. acs.est.3c02638. https://doi.org/10.1021/acs.est.3c02638</w:t>
+        <w:t xml:space="preserve">Brandão‐Dias, P.F.P., Hallack, D.M.C., Snyder, E.D., Tank, J.L., Bolster, D., Volponi, S., Shogren, A.J., Lamberti, G.A., Bibby, K., Egan, S.P., 2023. </w:t>
+      </w:r>
+      <w:r>
+        <w:t>Particle size influences decay rates of environmental DNA in aquatic systems. Molecular Ecology Resources 1755–0998.13751. https://doi.org/10.1111/1755-0998.13751</w:t>
       </w:r>
     </w:p>
     <w:p>
@@ -5244,83 +5196,7 @@
         <w:pStyle w:val="Bibliography"/>
       </w:pPr>
       <w:r>
-        <w:rPr>
-          <w:lang w:val="fr-FR"/>
-        </w:rPr>
-        <w:t xml:space="preserve">Brandão‐Dias, P.F.P., </w:t>
-      </w:r>
-      <w:proofErr w:type="spellStart"/>
-      <w:r>
-        <w:rPr>
-          <w:lang w:val="fr-FR"/>
-        </w:rPr>
-        <w:t>Hallack</w:t>
-      </w:r>
-      <w:proofErr w:type="spellEnd"/>
-      <w:r>
-        <w:rPr>
-          <w:lang w:val="fr-FR"/>
-        </w:rPr>
-        <w:t xml:space="preserve">, D.M.C., Snyder, E.D., Tank, J.L., </w:t>
-      </w:r>
-      <w:proofErr w:type="spellStart"/>
-      <w:r>
-        <w:rPr>
-          <w:lang w:val="fr-FR"/>
-        </w:rPr>
-        <w:t>Bolster</w:t>
-      </w:r>
-      <w:proofErr w:type="spellEnd"/>
-      <w:r>
-        <w:rPr>
-          <w:lang w:val="fr-FR"/>
-        </w:rPr>
-        <w:t xml:space="preserve">, D., </w:t>
-      </w:r>
-      <w:proofErr w:type="spellStart"/>
-      <w:r>
-        <w:rPr>
-          <w:lang w:val="fr-FR"/>
-        </w:rPr>
-        <w:t>Volponi</w:t>
-      </w:r>
-      <w:proofErr w:type="spellEnd"/>
-      <w:r>
-        <w:rPr>
-          <w:lang w:val="fr-FR"/>
-        </w:rPr>
-        <w:t xml:space="preserve">, S., Shogren, A.J., </w:t>
-      </w:r>
-      <w:proofErr w:type="spellStart"/>
-      <w:r>
-        <w:rPr>
-          <w:lang w:val="fr-FR"/>
-        </w:rPr>
-        <w:t>Lamberti</w:t>
-      </w:r>
-      <w:proofErr w:type="spellEnd"/>
-      <w:r>
-        <w:rPr>
-          <w:lang w:val="fr-FR"/>
-        </w:rPr>
-        <w:t xml:space="preserve">, G.A., </w:t>
-      </w:r>
-      <w:proofErr w:type="spellStart"/>
-      <w:r>
-        <w:rPr>
-          <w:lang w:val="fr-FR"/>
-        </w:rPr>
-        <w:t>Bibby</w:t>
-      </w:r>
-      <w:proofErr w:type="spellEnd"/>
-      <w:r>
-        <w:rPr>
-          <w:lang w:val="fr-FR"/>
-        </w:rPr>
-        <w:t xml:space="preserve">, K., Egan, S.P., 2023. </w:t>
-      </w:r>
-      <w:r>
-        <w:t>Particle size influences decay rates of environmental DNA in aquatic systems. Molecular Ecology Resources 1755–0998.13751. https://doi.org/10.1111/1755-0998.13751</w:t>
+        <w:t>Brandão-Dias P.F.P., Snyder E.D., Tank J.L., Mahl, U.H., Beters, B., Shogren A.J., Bolster D., Lamberti G.A., Bibby K, Egan S., n.d. Environmental DNA ecology is better associated with particle size than molecule length in recirculating streams. Under review in Environmental DNA.</w:t>
       </w:r>
     </w:p>
     <w:p>
@@ -5328,7 +5204,7 @@
         <w:pStyle w:val="Bibliography"/>
       </w:pPr>
       <w:r>
-        <w:t>Brandão-Dias P.F.P., Snyder E.D., Tank J.L., Mahl, U.H., Beters, B., Shogren A.J., Bolster D., Lamberti G.A., Bibby K, Egan S., n.d. Environmental DNA ecology is better associated with particle size than molecule length in recirculating streams. Under review in Environmental DNA.</w:t>
+        <w:t>Buxton, A.S., Groombridge, J.J., Zakaria, N.B., Griffiths, R.A., 2017. Seasonal variation in environmental DNA in relation to population size and environmental factors. Sci Rep 7, 46294. https://doi.org/10.1038/srep46294</w:t>
       </w:r>
     </w:p>
     <w:p>
@@ -5336,7 +5212,7 @@
         <w:pStyle w:val="Bibliography"/>
       </w:pPr>
       <w:r>
-        <w:t>Buxton, A.S., Groombridge, J.J., Zakaria, N.B., Griffiths, R.A., 2017. Seasonal variation in environmental DNA in relation to population size and environmental factors. Sci Rep 7, 46294. https://doi.org/10.1038/srep46294</w:t>
+        <w:t>Cribari-Neto, F., Zeileis, A., 2010. Beta Regression in R. Journal of Statistical Software 34, 1–24. https://doi.org/10.18637/jss.v034.i02</w:t>
       </w:r>
     </w:p>
     <w:p>
@@ -5344,15 +5220,7 @@
         <w:pStyle w:val="Bibliography"/>
       </w:pPr>
       <w:r>
-        <w:t xml:space="preserve">Cribari-Neto, F., </w:t>
-      </w:r>
-      <w:proofErr w:type="spellStart"/>
-      <w:r>
-        <w:t>Zeileis</w:t>
-      </w:r>
-      <w:proofErr w:type="spellEnd"/>
-      <w:r>
-        <w:t>, A., 2010. Beta Regression in R. Journal of Statistical Software 34, 1–24. https://doi.org/10.18637/jss.v034.i02</w:t>
+        <w:t>Curtis, A.N., Tiemann, J.S., Douglass, S.A., Davis, M.A., Larson, E.R., 2021. High stream flows dilute environmental DNA (eDNA) concentrations and reduce detectability. Diversity and Distributions 27, 1918–1931. https://doi.org/10.1111/ddi.13196</w:t>
       </w:r>
     </w:p>
     <w:p>
@@ -5360,7 +5228,7 @@
         <w:pStyle w:val="Bibliography"/>
       </w:pPr>
       <w:r>
-        <w:t>Curtis, A.N., Tiemann, J.S., Douglass, S.A., Davis, M.A., Larson, E.R., 2021. High stream flows dilute environmental DNA (eDNA) concentrations and reduce detectability. Diversity and Distributions 27, 1918–1931. https://doi.org/10.1111/ddi.13196</w:t>
+        <w:t>de Souza, L.S., Godwin, J.C., Renshaw, M.A., Larson, E., 2016. Environmental DNA (eDNA) Detection Probability Is Influenced by Seasonal Activity of Organisms. PLoS ONE 11, e0165273. https://doi.org/10.1371/journal.pone.0165273</w:t>
       </w:r>
     </w:p>
     <w:p>
@@ -5368,7 +5236,7 @@
         <w:pStyle w:val="Bibliography"/>
       </w:pPr>
       <w:r>
-        <w:t>de Souza, L.S., Godwin, J.C., Renshaw, M.A., Larson, E., 2016. Environmental DNA (eDNA) Detection Probability Is Influenced by Seasonal Activity of Organisms. PLoS ONE 11, e0165273. https://doi.org/10.1371/journal.pone.0165273</w:t>
+        <w:t>Deiner, K., Altermatt, F., 2014. Transport Distance of Invertebrate Environmental DNA in a Natural River. PLoS ONE 9, e88786. https://doi.org/10.1371/journal.pone.0088786</w:t>
       </w:r>
     </w:p>
     <w:p>
@@ -5376,23 +5244,7 @@
         <w:pStyle w:val="Bibliography"/>
       </w:pPr>
       <w:r>
-        <w:t>Deiner, K., Altermatt, F., 2014. Transport Distance of Invertebrate Environmental DNA in a Natural River. PLoS ONE 9, e88786. https://doi.org/10.1371/journal.pone.0088786</w:t>
-      </w:r>
-    </w:p>
-    <w:p>
-      <w:pPr>
-        <w:pStyle w:val="Bibliography"/>
-      </w:pPr>
-      <w:r>
-        <w:t>Dettinger, M.D., Diaz, H.F., 2000. Global Characteristics of Stream Flow Seasonality and Variability. J. Hydrometeor 1, 289–310. https://doi.org/10.1175/1525-7541(2000)001&lt;</w:t>
-      </w:r>
-      <w:proofErr w:type="gramStart"/>
-      <w:r>
-        <w:t>0289:GCOSFS</w:t>
-      </w:r>
-      <w:proofErr w:type="gramEnd"/>
-      <w:r>
-        <w:t>&gt;2.0.CO;2</w:t>
+        <w:t>Dettinger, M.D., Diaz, H.F., 2000. Global Characteristics of Stream Flow Seasonality and Variability. J. Hydrometeor 1, 289–310. https://doi.org/10.1175/1525-7541(2000)001&lt;0289:GCOSFS&gt;2.0.CO;2</w:t>
       </w:r>
     </w:p>
     <w:p>
@@ -5408,21 +5260,8 @@
       <w:pPr>
         <w:pStyle w:val="Bibliography"/>
       </w:pPr>
-      <w:proofErr w:type="spellStart"/>
-      <w:r>
-        <w:t>Fediajevaite</w:t>
-      </w:r>
-      <w:proofErr w:type="spellEnd"/>
-      <w:r>
-        <w:t xml:space="preserve">, J., Priestley, V., Arnold, R., Savolainen, V., 2021. Meta‐analysis shows that environmental DNA outperforms traditional surveys, but warrants better reporting standards. Ecol. </w:t>
-      </w:r>
-      <w:proofErr w:type="spellStart"/>
-      <w:r>
-        <w:t>Evol</w:t>
-      </w:r>
-      <w:proofErr w:type="spellEnd"/>
-      <w:r>
-        <w:t>. 11, 4803–4815. https://doi.org/10.1002/ece3.7382</w:t>
+      <w:r>
+        <w:t>Fediajevaite, J., Priestley, V., Arnold, R., Savolainen, V., 2021. Meta‐analysis shows that environmental DNA outperforms traditional surveys, but warrants better reporting standards. Ecol. Evol. 11, 4803–4815. https://doi.org/10.1002/ece3.7382</w:t>
       </w:r>
     </w:p>
     <w:p>
@@ -5430,36 +5269,15 @@
         <w:pStyle w:val="Bibliography"/>
       </w:pPr>
       <w:r>
-        <w:t xml:space="preserve">Goode, K., Rey, K., 2019. </w:t>
-      </w:r>
-      <w:proofErr w:type="spellStart"/>
-      <w:r>
-        <w:t>ggResidpanel</w:t>
-      </w:r>
-      <w:proofErr w:type="spellEnd"/>
-      <w:r>
-        <w:t>: Panels and Interactive Versions of Diagnostic Plots using “ggplot2.”</w:t>
+        <w:t>Goode, K., Rey, K., 2019. ggResidpanel: Panels and Interactive Versions of Diagnostic Plots using “ggplot2.”</w:t>
       </w:r>
     </w:p>
     <w:p>
       <w:pPr>
         <w:pStyle w:val="Bibliography"/>
       </w:pPr>
-      <w:proofErr w:type="spellStart"/>
-      <w:r>
-        <w:t>Guisan</w:t>
-      </w:r>
-      <w:proofErr w:type="spellEnd"/>
-      <w:r>
-        <w:t xml:space="preserve">, A., </w:t>
-      </w:r>
-      <w:proofErr w:type="spellStart"/>
-      <w:r>
-        <w:t>Thuiller</w:t>
-      </w:r>
-      <w:proofErr w:type="spellEnd"/>
-      <w:r>
-        <w:t>, W., 2005. Predicting species distribution: offering more than simple habitat models. Ecology Letters 8, 993–1009. https://doi.org/10.1111/j.1461-0248.2005.00792.x</w:t>
+      <w:r>
+        <w:t>Guisan, A., Thuiller, W., 2005. Predicting species distribution: offering more than simple habitat models. Ecology Letters 8, 993–1009. https://doi.org/10.1111/j.1461-0248.2005.00792.x</w:t>
       </w:r>
     </w:p>
     <w:p>
@@ -5475,36 +5293,15 @@
         <w:pStyle w:val="Bibliography"/>
       </w:pPr>
       <w:r>
-        <w:t xml:space="preserve">Harrell Jr, F.E., 2023. </w:t>
-      </w:r>
-      <w:proofErr w:type="spellStart"/>
-      <w:r>
-        <w:t>Hmisc</w:t>
-      </w:r>
-      <w:proofErr w:type="spellEnd"/>
-      <w:r>
-        <w:t>: Harrell Miscellaneous.</w:t>
+        <w:t>Harrell Jr, F.E., 2023. Hmisc: Harrell Miscellaneous.</w:t>
       </w:r>
     </w:p>
     <w:p>
       <w:pPr>
         <w:pStyle w:val="Bibliography"/>
       </w:pPr>
-      <w:proofErr w:type="spellStart"/>
-      <w:r>
-        <w:t>Hullar</w:t>
-      </w:r>
-      <w:proofErr w:type="spellEnd"/>
-      <w:r>
-        <w:t xml:space="preserve">, M.A.J., Kaplan, L.A., Stahl, D.A., 2006. Recurring Seasonal Dynamics of Microbial Communities in Stream Habitats. Appl Environ </w:t>
-      </w:r>
-      <w:proofErr w:type="spellStart"/>
-      <w:r>
-        <w:t>Microbiol</w:t>
-      </w:r>
-      <w:proofErr w:type="spellEnd"/>
-      <w:r>
-        <w:t xml:space="preserve"> 72, 713–722. https://doi.org/10.1128/AEM.72.1.713-722.2006</w:t>
+      <w:r>
+        <w:t>Hullar, M.A.J., Kaplan, L.A., Stahl, D.A., 2006. Recurring Seasonal Dynamics of Microbial Communities in Stream Habitats. Appl Environ Microbiol 72, 713–722. https://doi.org/10.1128/AEM.72.1.713-722.2006</w:t>
       </w:r>
     </w:p>
     <w:p>
@@ -5512,15 +5309,7 @@
         <w:pStyle w:val="Bibliography"/>
       </w:pPr>
       <w:r>
-        <w:t xml:space="preserve">Jerde, C.L., Mahon, A.R., </w:t>
-      </w:r>
-      <w:proofErr w:type="spellStart"/>
-      <w:r>
-        <w:t>Chadderton</w:t>
-      </w:r>
-      <w:proofErr w:type="spellEnd"/>
-      <w:r>
-        <w:t>, W.L., Lodge, D.M., 2011. “Sight-unseen” detection of rare aquatic species using environmental DNA: eDNA surveillance of rare aquatic species. Conservation Letters 4, 150–157. https://doi.org/10.1111/j.1755-263X.2010.00158.x</w:t>
+        <w:t>Jerde, C.L., Mahon, A.R., Chadderton, W.L., Lodge, D.M., 2011. “Sight-unseen” detection of rare aquatic species using environmental DNA: eDNA surveillance of rare aquatic species. Conservation Letters 4, 150–157. https://doi.org/10.1111/j.1755-263X.2010.00158.x</w:t>
       </w:r>
     </w:p>
     <w:p>
@@ -5535,21 +5324,8 @@
       <w:pPr>
         <w:pStyle w:val="Bibliography"/>
       </w:pPr>
-      <w:proofErr w:type="spellStart"/>
-      <w:r>
-        <w:t>Klymus</w:t>
-      </w:r>
-      <w:proofErr w:type="spellEnd"/>
-      <w:r>
-        <w:t xml:space="preserve">, K.E., Merkes, C.M., Allison, M.J., Goldberg, C.S., Helbing, C.C., Hunter, M.E., Jackson, C.A., Lance, R.F., Mangan, A.M., Monroe, E.M., Piaggio, A.J., </w:t>
-      </w:r>
-      <w:proofErr w:type="spellStart"/>
-      <w:r>
-        <w:t>Stokdyk</w:t>
-      </w:r>
-      <w:proofErr w:type="spellEnd"/>
-      <w:r>
-        <w:t>, J.P., Wilson, C.C., Richter, C.A., 2020. Reporting the limits of detection and quantification for environmental DNA assays. Environmental DNA 2, 271–282. https://doi.org/10.1002/edn3.29</w:t>
+      <w:r>
+        <w:t>Klymus, K.E., Merkes, C.M., Allison, M.J., Goldberg, C.S., Helbing, C.C., Hunter, M.E., Jackson, C.A., Lance, R.F., Mangan, A.M., Monroe, E.M., Piaggio, A.J., Stokdyk, J.P., Wilson, C.C., Richter, C.A., 2020. Reporting the limits of detection and quantification for environmental DNA assays. Environmental DNA 2, 271–282. https://doi.org/10.1002/edn3.29</w:t>
       </w:r>
     </w:p>
     <w:p>
@@ -5557,23 +5333,7 @@
         <w:pStyle w:val="Bibliography"/>
       </w:pPr>
       <w:r>
-        <w:t xml:space="preserve">Lance, R., </w:t>
-      </w:r>
-      <w:proofErr w:type="spellStart"/>
-      <w:r>
-        <w:t>Klymus</w:t>
-      </w:r>
-      <w:proofErr w:type="spellEnd"/>
-      <w:r>
-        <w:t xml:space="preserve">, K., Richter, C., Guan, X., Farrington, H., Carr, M., Thompson, N., Chapman, D., </w:t>
-      </w:r>
-      <w:proofErr w:type="spellStart"/>
-      <w:r>
-        <w:t>Baerwaldt</w:t>
-      </w:r>
-      <w:proofErr w:type="spellEnd"/>
-      <w:r>
-        <w:t>, K., 2017. Experimental observations on the decay of environmental DNA from bighead and silver carps. MBI 8, 343–359. https://doi.org/10.3391/mbi.2017.8.3.08</w:t>
+        <w:t>Lance, R., Klymus, K., Richter, C., Guan, X., Farrington, H., Carr, M., Thompson, N., Chapman, D., Baerwaldt, K., 2017. Experimental observations on the decay of environmental DNA from bighead and silver carps. MBI 8, 343–359. https://doi.org/10.3391/mbi.2017.8.3.08</w:t>
       </w:r>
     </w:p>
     <w:p>
@@ -5588,13 +5348,8 @@
       <w:pPr>
         <w:pStyle w:val="Bibliography"/>
       </w:pPr>
-      <w:proofErr w:type="spellStart"/>
-      <w:r>
-        <w:t>Magurran</w:t>
-      </w:r>
-      <w:proofErr w:type="spellEnd"/>
-      <w:r>
-        <w:t>, A.E., 2004. Measuring biological diversity. Blackwell Pub, Malden, Ma.</w:t>
+      <w:r>
+        <w:t>Magurran, A.E., 2004. Measuring biological diversity. Blackwell Pub, Malden, Ma.</w:t>
       </w:r>
     </w:p>
     <w:p>
@@ -5610,15 +5365,7 @@
         <w:pStyle w:val="Bibliography"/>
       </w:pPr>
       <w:r>
-        <w:t xml:space="preserve">Marks, J.C., 2019. Revisiting the Fates of Dead Leaves That Fall into Streams. Annu. Rev. Ecol. </w:t>
-      </w:r>
-      <w:proofErr w:type="spellStart"/>
-      <w:r>
-        <w:t>Evol</w:t>
-      </w:r>
-      <w:proofErr w:type="spellEnd"/>
-      <w:r>
-        <w:t>. Syst. 50, 547–568. https://doi.org/10.1146/annurev-ecolsys-110218-024755</w:t>
+        <w:t>Marks, J.C., 2019. Revisiting the Fates of Dead Leaves That Fall into Streams. Annu. Rev. Ecol. Evol. Syst. 50, 547–568. https://doi.org/10.1146/annurev-ecolsys-110218-024755</w:t>
       </w:r>
     </w:p>
     <w:p>
@@ -5633,37 +5380,8 @@
       <w:pPr>
         <w:pStyle w:val="Bibliography"/>
       </w:pPr>
-      <w:proofErr w:type="spellStart"/>
-      <w:r>
-        <w:t>Polato</w:t>
-      </w:r>
-      <w:proofErr w:type="spellEnd"/>
-      <w:r>
-        <w:t xml:space="preserve">, N.R., Gill, B.A., Shah, A.A., Gray, M.M., Casner, K.L., </w:t>
-      </w:r>
-      <w:proofErr w:type="spellStart"/>
-      <w:r>
-        <w:t>Barthelet</w:t>
-      </w:r>
-      <w:proofErr w:type="spellEnd"/>
-      <w:r>
-        <w:t xml:space="preserve">, A., Messer, P.W., Simmons, M.P., </w:t>
-      </w:r>
-      <w:proofErr w:type="spellStart"/>
-      <w:r>
-        <w:t>Guayasamin</w:t>
-      </w:r>
-      <w:proofErr w:type="spellEnd"/>
-      <w:r>
-        <w:t xml:space="preserve">, J.M., Encalada, A.C., Kondratieff, B.C., Flecker, A.S., Thomas, S.A., </w:t>
-      </w:r>
-      <w:proofErr w:type="spellStart"/>
-      <w:r>
-        <w:t>Ghalambor</w:t>
-      </w:r>
-      <w:proofErr w:type="spellEnd"/>
-      <w:r>
-        <w:t>, C.K., Poff, N.L., Funk, W.C., Zamudio, K.R., 2018. Narrow thermal tolerance and low dispersal drive higher speciation in tropical mountains. Proc. Natl. Acad. Sci. U.S.A. 115, 12471–12476. https://doi.org/10.1073/pnas.1809326115</w:t>
+      <w:r>
+        <w:t>Polato, N.R., Gill, B.A., Shah, A.A., Gray, M.M., Casner, K.L., Barthelet, A., Messer, P.W., Simmons, M.P., Guayasamin, J.M., Encalada, A.C., Kondratieff, B.C., Flecker, A.S., Thomas, S.A., Ghalambor, C.K., Poff, N.L., Funk, W.C., Zamudio, K.R., 2018. Narrow thermal tolerance and low dispersal drive higher speciation in tropical mountains. Proc. Natl. Acad. Sci. U.S.A. 115, 12471–12476. https://doi.org/10.1073/pnas.1809326115</w:t>
       </w:r>
     </w:p>
     <w:p>
@@ -5688,15 +5406,7 @@
         <w:pStyle w:val="Bibliography"/>
       </w:pPr>
       <w:r>
-        <w:t xml:space="preserve">Rivera, S.F., </w:t>
-      </w:r>
-      <w:proofErr w:type="spellStart"/>
-      <w:r>
-        <w:t>Vasselon</w:t>
-      </w:r>
-      <w:proofErr w:type="spellEnd"/>
-      <w:r>
-        <w:t>, V., Bouchez, A., Rimet, F., 2023. eDNA metabarcoding from aquatic biofilms allows studying spatial and temporal fluctuations of fish communities from Lake Geneva. Environmental DNA edn3.413. https://doi.org/10.1002/edn3.413</w:t>
+        <w:t>Rivera, S.F., Vasselon, V., Bouchez, A., Rimet, F., 2023. eDNA metabarcoding from aquatic biofilms allows studying spatial and temporal fluctuations of fish communities from Lake Geneva. Environmental DNA edn3.413. https://doi.org/10.1002/edn3.413</w:t>
       </w:r>
     </w:p>
     <w:p>
@@ -5704,15 +5414,7 @@
         <w:pStyle w:val="Bibliography"/>
       </w:pPr>
       <w:r>
-        <w:t xml:space="preserve">Roche, K.R., Drummond, J.D., </w:t>
-      </w:r>
-      <w:proofErr w:type="spellStart"/>
-      <w:r>
-        <w:t>Boano</w:t>
-      </w:r>
-      <w:proofErr w:type="spellEnd"/>
-      <w:r>
-        <w:t>, F., Packman, A.I., Battin, T.J., Hunter, W.R., 2017. Benthic biofilm controls on fine particle dynamics in streams. Water Resources Research 53, 222–236. https://doi.org/10.1002/2016WR019041</w:t>
+        <w:t>Roche, K.R., Drummond, J.D., Boano, F., Packman, A.I., Battin, T.J., Hunter, W.R., 2017. Benthic biofilm controls on fine particle dynamics in streams. Water Resources Research 53, 222–236. https://doi.org/10.1002/2016WR019041</w:t>
       </w:r>
     </w:p>
     <w:p>
@@ -5720,33 +5422,7 @@
         <w:pStyle w:val="Bibliography"/>
       </w:pPr>
       <w:r>
-        <w:t xml:space="preserve">Sambrook, J., Russell, D.W., 2006. Purification of Nucleic Acids by Extraction with </w:t>
-      </w:r>
-      <w:proofErr w:type="spellStart"/>
-      <w:proofErr w:type="gramStart"/>
-      <w:r>
-        <w:t>Phenol:Chloroform</w:t>
-      </w:r>
-      <w:proofErr w:type="spellEnd"/>
-      <w:proofErr w:type="gramEnd"/>
-      <w:r>
-        <w:t xml:space="preserve">. Cold Spring Harb </w:t>
-      </w:r>
-      <w:proofErr w:type="spellStart"/>
-      <w:r>
-        <w:t>Protoc</w:t>
-      </w:r>
-      <w:proofErr w:type="spellEnd"/>
-      <w:r>
-        <w:t xml:space="preserve"> 2006, </w:t>
-      </w:r>
-      <w:proofErr w:type="gramStart"/>
-      <w:r>
-        <w:t>pdb.prot</w:t>
-      </w:r>
-      <w:proofErr w:type="gramEnd"/>
-      <w:r>
-        <w:t>4455. https://doi.org/10.1101/pdb.prot4455</w:t>
+        <w:t>Sambrook, J., Russell, D.W., 2006. Purification of Nucleic Acids by Extraction with Phenol:Chloroform. Cold Spring Harb Protoc 2006, pdb.prot4455. https://doi.org/10.1101/pdb.prot4455</w:t>
       </w:r>
     </w:p>
     <w:p>
@@ -5786,28 +5462,15 @@
         <w:pStyle w:val="Bibliography"/>
       </w:pPr>
       <w:r>
-        <w:t xml:space="preserve">Strickler, K.M., </w:t>
-      </w:r>
-      <w:proofErr w:type="spellStart"/>
-      <w:r>
-        <w:t>Fremier</w:t>
-      </w:r>
-      <w:proofErr w:type="spellEnd"/>
-      <w:r>
-        <w:t>, A.K., Goldberg, C.S., 2015. Quantifying effects of UV-B, temperature, and pH on eDNA degradation in aquatic microcosms. Biological Conservation 183, 85–92. https://doi.org/10.1016/j.biocon.2014.11.038</w:t>
+        <w:t>Strickler, K.M., Fremier, A.K., Goldberg, C.S., 2015. Quantifying effects of UV-B, temperature, and pH on eDNA degradation in aquatic microcosms. Biological Conservation 183, 85–92. https://doi.org/10.1016/j.biocon.2014.11.038</w:t>
       </w:r>
     </w:p>
     <w:p>
       <w:pPr>
         <w:pStyle w:val="Bibliography"/>
       </w:pPr>
-      <w:proofErr w:type="spellStart"/>
-      <w:r>
-        <w:t>Suberkropp</w:t>
-      </w:r>
-      <w:proofErr w:type="spellEnd"/>
-      <w:r>
-        <w:t>, K., Klug, M.J., 1980. The maceration of deciduous leaf litter by aquatic hyphomycetes. Can. J. Bot. 58, 1025–1031. https://doi.org/10.1139/b80-126</w:t>
+      <w:r>
+        <w:t>Suberkropp, K., Klug, M.J., 1980. The maceration of deciduous leaf litter by aquatic hyphomycetes. Can. J. Bot. 58, 1025–1031. https://doi.org/10.1139/b80-126</w:t>
       </w:r>
     </w:p>
     <w:p>
@@ -5815,39 +5478,7 @@
         <w:pStyle w:val="Bibliography"/>
       </w:pPr>
       <w:r>
-        <w:t xml:space="preserve">Tabacchi, E., Lambs, L., </w:t>
-      </w:r>
-      <w:proofErr w:type="spellStart"/>
-      <w:r>
-        <w:t>Guilloy</w:t>
-      </w:r>
-      <w:proofErr w:type="spellEnd"/>
-      <w:r>
-        <w:t xml:space="preserve">, H., Planty-Tabacchi, A.-M., Muller, E., </w:t>
-      </w:r>
-      <w:proofErr w:type="spellStart"/>
-      <w:r>
-        <w:t>Décamps</w:t>
-      </w:r>
-      <w:proofErr w:type="spellEnd"/>
-      <w:r>
-        <w:t xml:space="preserve">, H., 2000. Impacts of riparian vegetation on hydrological processes. </w:t>
-      </w:r>
-      <w:proofErr w:type="spellStart"/>
-      <w:r>
-        <w:t>Hydrol</w:t>
-      </w:r>
-      <w:proofErr w:type="spellEnd"/>
-      <w:r>
-        <w:t>. Process. 14, 2959–2976. https://doi.org/10.1002/1099-1085(200011/12)14:16/17&lt;</w:t>
-      </w:r>
-      <w:proofErr w:type="gramStart"/>
-      <w:r>
-        <w:t>2959::</w:t>
-      </w:r>
-      <w:proofErr w:type="gramEnd"/>
-      <w:r>
-        <w:t>AID-HYP129&gt;3.0.CO;2-B</w:t>
+        <w:t>Tabacchi, E., Lambs, L., Guilloy, H., Planty-Tabacchi, A.-M., Muller, E., Décamps, H., 2000. Impacts of riparian vegetation on hydrological processes. Hydrol. Process. 14, 2959–2976. https://doi.org/10.1002/1099-1085(200011/12)14:16/17&lt;2959::AID-HYP129&gt;3.0.CO;2-B</w:t>
       </w:r>
     </w:p>
     <w:p>
@@ -5869,15 +5500,7 @@
         <w:pStyle w:val="Bibliography"/>
       </w:pPr>
       <w:r>
-        <w:t xml:space="preserve">Tank, J.L., Rosi-Marshall, E.J., Griffiths, N.A., Entrekin, S.A., Stephen, M.L., 2010. A review of allochthonous organic matter dynamics and metabolism in streams. Journal of the North American </w:t>
-      </w:r>
-      <w:proofErr w:type="spellStart"/>
-      <w:r>
-        <w:t>Benthological</w:t>
-      </w:r>
-      <w:proofErr w:type="spellEnd"/>
-      <w:r>
-        <w:t xml:space="preserve"> Society 29, 118–146. https://doi.org/10.1899/08-170.1</w:t>
+        <w:t>Tank, J.L., Rosi-Marshall, E.J., Griffiths, N.A., Entrekin, S.A., Stephen, M.L., 2010. A review of allochthonous organic matter dynamics and metabolism in streams. Journal of the North American Benthological Society 29, 118–146. https://doi.org/10.1899/08-170.1</w:t>
       </w:r>
     </w:p>
     <w:p>
@@ -5886,36 +5509,15 @@
       </w:pPr>
       <w:r>
         <w:lastRenderedPageBreak/>
-        <w:t xml:space="preserve">Tank, J.L., Winterbourn, M.J., 1996. Microbial activity and invertebrate </w:t>
-      </w:r>
-      <w:proofErr w:type="spellStart"/>
-      <w:r>
-        <w:t>colonisation</w:t>
-      </w:r>
-      <w:proofErr w:type="spellEnd"/>
-      <w:r>
-        <w:t xml:space="preserve"> of wood in a New Zealand forest stream. New Zealand Journal of Marine and Freshwater Research 30, 271–280. https://doi.org/10.1080/00288330.1996.9516714</w:t>
+        <w:t>Tank, J.L., Winterbourn, M.J., 1996. Microbial activity and invertebrate colonisation of wood in a New Zealand forest stream. New Zealand Journal of Marine and Freshwater Research 30, 271–280. https://doi.org/10.1080/00288330.1996.9516714</w:t>
       </w:r>
     </w:p>
     <w:p>
       <w:pPr>
         <w:pStyle w:val="Bibliography"/>
       </w:pPr>
-      <w:proofErr w:type="spellStart"/>
-      <w:r>
-        <w:t>Thalinger</w:t>
-      </w:r>
-      <w:proofErr w:type="spellEnd"/>
-      <w:r>
-        <w:t xml:space="preserve">, B., Kirschner, D., Pütz, Y., Moritz, C., Schwarzenberger, R., </w:t>
-      </w:r>
-      <w:proofErr w:type="spellStart"/>
-      <w:r>
-        <w:t>Wanzenböck</w:t>
-      </w:r>
-      <w:proofErr w:type="spellEnd"/>
-      <w:r>
-        <w:t>, J., Traugott, M., 2021. Lateral and longitudinal fish environmental DNA distribution in dynamic riverine habitats. Environmental DNA 3, 305–318. https://doi.org/10.1002/edn3.171</w:t>
+      <w:r>
+        <w:t>Thalinger, B., Kirschner, D., Pütz, Y., Moritz, C., Schwarzenberger, R., Wanzenböck, J., Traugott, M., 2021. Lateral and longitudinal fish environmental DNA distribution in dynamic riverine habitats. Environmental DNA 3, 305–318. https://doi.org/10.1002/edn3.171</w:t>
       </w:r>
     </w:p>
     <w:p>
@@ -5931,23 +5533,7 @@
         <w:pStyle w:val="Bibliography"/>
       </w:pPr>
       <w:r>
-        <w:t xml:space="preserve">Wallace, J.B., Webster, J.R., </w:t>
-      </w:r>
-      <w:proofErr w:type="spellStart"/>
-      <w:r>
-        <w:t>Cuffney</w:t>
-      </w:r>
-      <w:proofErr w:type="spellEnd"/>
-      <w:r>
-        <w:t xml:space="preserve">, T.F., 1982. Stream detritus dynamics: Regulation by invertebrate consumers. </w:t>
-      </w:r>
-      <w:proofErr w:type="spellStart"/>
-      <w:r>
-        <w:t>Oecologia</w:t>
-      </w:r>
-      <w:proofErr w:type="spellEnd"/>
-      <w:r>
-        <w:t xml:space="preserve"> 53, 197–200. https://doi.org/10.1007/BF00545663</w:t>
+        <w:t>Wallace, J.B., Webster, J.R., Cuffney, T.F., 1982. Stream detritus dynamics: Regulation by invertebrate consumers. Oecologia 53, 197–200. https://doi.org/10.1007/BF00545663</w:t>
       </w:r>
     </w:p>
     <w:p>
@@ -5955,15 +5541,7 @@
         <w:pStyle w:val="Bibliography"/>
       </w:pPr>
       <w:r>
-        <w:t xml:space="preserve">Webster, J.R., Benfield, E.F., Ehrman, T.P., Schaeffer, M.A., Tank, J.L., Hutchens, J.J., D’Angelo, D.J., 1999. What happens to allochthonous material that falls into streams? A synthesis of new and published information from </w:t>
-      </w:r>
-      <w:proofErr w:type="spellStart"/>
-      <w:r>
-        <w:t>Coweeta</w:t>
-      </w:r>
-      <w:proofErr w:type="spellEnd"/>
-      <w:r>
-        <w:t>. Freshwater Biology 41, 687–705. https://doi.org/10.1046/j.1365-2427.1999.00409.x</w:t>
+        <w:t>Webster, J.R., Benfield, E.F., Ehrman, T.P., Schaeffer, M.A., Tank, J.L., Hutchens, J.J., D’Angelo, D.J., 1999. What happens to allochthonous material that falls into streams? A synthesis of new and published information from Coweeta. Freshwater Biology 41, 687–705. https://doi.org/10.1046/j.1365-2427.1999.00409.x</w:t>
       </w:r>
     </w:p>
     <w:p>
@@ -5979,23 +5557,7 @@
         <w:pStyle w:val="Bibliography"/>
       </w:pPr>
       <w:r>
-        <w:t xml:space="preserve">Zhao, B., Van </w:t>
-      </w:r>
-      <w:proofErr w:type="spellStart"/>
-      <w:r>
-        <w:t>Bodegom</w:t>
-      </w:r>
-      <w:proofErr w:type="spellEnd"/>
-      <w:r>
-        <w:t xml:space="preserve">, P.M., </w:t>
-      </w:r>
-      <w:proofErr w:type="spellStart"/>
-      <w:r>
-        <w:t>Trimbos</w:t>
-      </w:r>
-      <w:proofErr w:type="spellEnd"/>
-      <w:r>
-        <w:t>, K., 2021. The particle size distribution of environmental DNA varies with species and degradation. Science of The Total Environment 797, 149175. https://doi.org/10.1016/j.scitotenv.2021.149175</w:t>
+        <w:t>Zhao, B., Van Bodegom, P.M., Trimbos, K., 2021. The particle size distribution of environmental DNA varies with species and degradation. Science of The Total Environment 797, 149175. https://doi.org/10.1016/j.scitotenv.2021.149175</w:t>
       </w:r>
     </w:p>
     <w:p>
@@ -6003,23 +5565,7 @@
         <w:pStyle w:val="Bibliography"/>
       </w:pPr>
       <w:r>
-        <w:t xml:space="preserve">Zhao, B., Van </w:t>
-      </w:r>
-      <w:proofErr w:type="spellStart"/>
-      <w:r>
-        <w:t>Bodegom</w:t>
-      </w:r>
-      <w:proofErr w:type="spellEnd"/>
-      <w:r>
-        <w:t xml:space="preserve">, P.M., </w:t>
-      </w:r>
-      <w:proofErr w:type="spellStart"/>
-      <w:r>
-        <w:t>Trimbos</w:t>
-      </w:r>
-      <w:proofErr w:type="spellEnd"/>
-      <w:r>
-        <w:t>, K.B., 2023. Bacterial abundance and pH associate with eDNA degradation in water from various aquatic ecosystems in a laboratory setting. Front. Environ. Sci. 11, 1025105. https://doi.org/10.3389/fenvs.2023.1025105</w:t>
+        <w:t>Zhao, B., Van Bodegom, P.M., Trimbos, K.B., 2023. Bacterial abundance and pH associate with eDNA degradation in water from various aquatic ecosystems in a laboratory setting. Front. Environ. Sci. 11, 1025105. https://doi.org/10.3389/fenvs.2023.1025105</w:t>
       </w:r>
     </w:p>
     <w:p>
@@ -6034,98 +5580,6 @@
       </w:pPr>
       <w:r>
         <w:fldChar w:fldCharType="end"/>
-      </w:r>
-    </w:p>
-    <w:p>
-      <w:pPr>
-        <w:spacing w:after="0"/>
-        <w:jc w:val="left"/>
-        <w:rPr>
-          <w:lang w:val="fr-FR"/>
-        </w:rPr>
-      </w:pPr>
-      <w:r>
-        <w:rPr>
-          <w:lang w:val="fr-FR"/>
-        </w:rPr>
-        <w:br w:type="page"/>
-      </w:r>
-    </w:p>
-    <w:p>
-      <w:pPr>
-        <w:pStyle w:val="BDAbstract"/>
-        <w:rPr>
-          <w:lang w:val="fr-FR"/>
-        </w:rPr>
-      </w:pPr>
-      <w:r>
-        <w:rPr>
-          <w:lang w:val="fr-FR"/>
-        </w:rPr>
-        <w:lastRenderedPageBreak/>
-        <w:t xml:space="preserve">For Table of Contents </w:t>
-      </w:r>
-      <w:proofErr w:type="spellStart"/>
-      <w:r>
-        <w:rPr>
-          <w:lang w:val="fr-FR"/>
-        </w:rPr>
-        <w:t>Only</w:t>
-      </w:r>
-      <w:proofErr w:type="spellEnd"/>
-    </w:p>
-    <w:p>
-      <w:pPr>
-        <w:pStyle w:val="TAMainText"/>
-        <w:rPr>
-          <w:lang w:val="fr-FR"/>
-        </w:rPr>
-      </w:pPr>
-      <w:r>
-        <w:rPr>
-          <w:noProof/>
-        </w:rPr>
-        <w:drawing>
-          <wp:inline distT="0" distB="0" distL="0" distR="0" wp14:anchorId="7A980126" wp14:editId="3032D7CF">
-            <wp:extent cx="2971800" cy="1600200"/>
-            <wp:effectExtent l="0" t="0" r="0" b="0"/>
-            <wp:docPr id="529979414" name="Picture 1"/>
-            <wp:cNvGraphicFramePr>
-              <a:graphicFrameLocks xmlns:a="http://schemas.openxmlformats.org/drawingml/2006/main" noChangeAspect="1"/>
-            </wp:cNvGraphicFramePr>
-            <a:graphic xmlns:a="http://schemas.openxmlformats.org/drawingml/2006/main">
-              <a:graphicData uri="http://schemas.openxmlformats.org/drawingml/2006/picture">
-                <pic:pic xmlns:pic="http://schemas.openxmlformats.org/drawingml/2006/picture">
-                  <pic:nvPicPr>
-                    <pic:cNvPr id="529979414" name="Picture 529979414"/>
-                    <pic:cNvPicPr/>
-                  </pic:nvPicPr>
-                  <pic:blipFill>
-                    <a:blip r:embed="rId26" cstate="print">
-                      <a:extLst>
-                        <a:ext uri="{28A0092B-C50C-407E-A947-70E740481C1C}">
-                          <a14:useLocalDpi xmlns:a14="http://schemas.microsoft.com/office/drawing/2010/main" val="0"/>
-                        </a:ext>
-                      </a:extLst>
-                    </a:blip>
-                    <a:stretch>
-                      <a:fillRect/>
-                    </a:stretch>
-                  </pic:blipFill>
-                  <pic:spPr>
-                    <a:xfrm>
-                      <a:off x="0" y="0"/>
-                      <a:ext cx="2971800" cy="1600200"/>
-                    </a:xfrm>
-                    <a:prstGeom prst="rect">
-                      <a:avLst/>
-                    </a:prstGeom>
-                  </pic:spPr>
-                </pic:pic>
-              </a:graphicData>
-            </a:graphic>
-          </wp:inline>
-        </w:drawing>
       </w:r>
     </w:p>
     <w:sectPr>
@@ -7403,6 +6857,7 @@
   <w:style w:type="character" w:default="1" w:styleId="DefaultParagraphFont">
     <w:name w:val="Default Paragraph Font"/>
     <w:uiPriority w:val="1"/>
+    <w:semiHidden/>
     <w:unhideWhenUsed/>
   </w:style>
   <w:style w:type="table" w:default="1" w:styleId="TableNormal">

</xml_diff>